<commit_message>
147) Proyecto 1 Sitio Web/CMS LAESH deploy Producción en hostinger VM con dominio laesh.mx. Scripts setup reproducibles, esten al 94%,ToDos: Proyecto 1: Estabilizar index.php/cms/medico/recepcion issues/gaps encontrados con|por Laesh (fix: Samsung Galaxy Tab S10 Ultra ?. Falta pruebas estabilización integrales: Catalogo de estudios, Tabla, Gabinetes. Estabilización de/con Ws/Swoole/Seguridad al 90%. Avance en Block digital al:76%. Fixes 22-25-09 laesh: Se descarto v2 website: video de inicio, y banner de anuncios en cms/website. Falta en WebSite: completar publicación en SEO Google search 84%, Falta de optimizar lo del cache v?=time, swole, opcache, rte letras y tamaños. Sacar medidas para imagenes, pruebas flujos. Issues: back button.
</commit_message>
<xml_diff>
--- a/portafolio-dev-2026/blocklabgd/v1.2/contrato/Acta_Aceptacion_Adenda_Sitio_Web_v4.docx
+++ b/portafolio-dev-2026/blocklabgd/v1.2/contrato/Acta_Aceptacion_Adenda_Sitio_Web_v4.docx
@@ -228,8 +228,8 @@
         </w:tblCellMar>
       </w:tblPr>
       <w:tblGrid>
-        <w:gridCol w:w="2908"/>
-        <w:gridCol w:w="7064"/>
+        <w:gridCol w:w="2881"/>
+        <w:gridCol w:w="7091"/>
       </w:tblGrid>
       <w:tr>
         <w:trPr>
@@ -237,7 +237,7 @@
         </w:trPr>
         <w:tc>
           <w:tcPr>
-            <w:tcW w:w="2908" w:type="dxa"/>
+            <w:tcW w:w="2881" w:type="dxa"/>
             <w:tcBorders/>
             <w:vAlign w:val="center"/>
           </w:tcPr>
@@ -257,7 +257,7 @@
         </w:tc>
         <w:tc>
           <w:tcPr>
-            <w:tcW w:w="7064" w:type="dxa"/>
+            <w:tcW w:w="7091" w:type="dxa"/>
             <w:tcBorders/>
             <w:vAlign w:val="center"/>
           </w:tcPr>
@@ -280,7 +280,7 @@
         <w:trPr/>
         <w:tc>
           <w:tcPr>
-            <w:tcW w:w="2908" w:type="dxa"/>
+            <w:tcW w:w="2881" w:type="dxa"/>
             <w:tcBorders/>
             <w:vAlign w:val="center"/>
           </w:tcPr>
@@ -302,7 +302,7 @@
         </w:tc>
         <w:tc>
           <w:tcPr>
-            <w:tcW w:w="7064" w:type="dxa"/>
+            <w:tcW w:w="7091" w:type="dxa"/>
             <w:tcBorders/>
             <w:vAlign w:val="center"/>
           </w:tcPr>
@@ -325,7 +325,7 @@
         <w:trPr/>
         <w:tc>
           <w:tcPr>
-            <w:tcW w:w="2908" w:type="dxa"/>
+            <w:tcW w:w="2881" w:type="dxa"/>
             <w:tcBorders/>
             <w:vAlign w:val="center"/>
           </w:tcPr>
@@ -347,7 +347,7 @@
         </w:tc>
         <w:tc>
           <w:tcPr>
-            <w:tcW w:w="7064" w:type="dxa"/>
+            <w:tcW w:w="7091" w:type="dxa"/>
             <w:tcBorders/>
             <w:vAlign w:val="center"/>
           </w:tcPr>
@@ -370,7 +370,7 @@
         <w:trPr/>
         <w:tc>
           <w:tcPr>
-            <w:tcW w:w="2908" w:type="dxa"/>
+            <w:tcW w:w="2881" w:type="dxa"/>
             <w:tcBorders/>
             <w:vAlign w:val="center"/>
           </w:tcPr>
@@ -392,7 +392,7 @@
         </w:tc>
         <w:tc>
           <w:tcPr>
-            <w:tcW w:w="7064" w:type="dxa"/>
+            <w:tcW w:w="7091" w:type="dxa"/>
             <w:tcBorders/>
             <w:vAlign w:val="center"/>
           </w:tcPr>
@@ -415,7 +415,7 @@
         <w:trPr/>
         <w:tc>
           <w:tcPr>
-            <w:tcW w:w="2908" w:type="dxa"/>
+            <w:tcW w:w="2881" w:type="dxa"/>
             <w:tcBorders/>
             <w:vAlign w:val="center"/>
           </w:tcPr>
@@ -437,7 +437,7 @@
         </w:tc>
         <w:tc>
           <w:tcPr>
-            <w:tcW w:w="7064" w:type="dxa"/>
+            <w:tcW w:w="7091" w:type="dxa"/>
             <w:tcBorders/>
             <w:vAlign w:val="center"/>
           </w:tcPr>
@@ -488,8 +488,8 @@
         </w:tblCellMar>
       </w:tblPr>
       <w:tblGrid>
-        <w:gridCol w:w="7021"/>
-        <w:gridCol w:w="2951"/>
+        <w:gridCol w:w="7031"/>
+        <w:gridCol w:w="2941"/>
       </w:tblGrid>
       <w:tr>
         <w:trPr>
@@ -497,7 +497,7 @@
         </w:trPr>
         <w:tc>
           <w:tcPr>
-            <w:tcW w:w="7021" w:type="dxa"/>
+            <w:tcW w:w="7031" w:type="dxa"/>
             <w:tcBorders/>
             <w:vAlign w:val="center"/>
           </w:tcPr>
@@ -517,7 +517,7 @@
         </w:tc>
         <w:tc>
           <w:tcPr>
-            <w:tcW w:w="2951" w:type="dxa"/>
+            <w:tcW w:w="2941" w:type="dxa"/>
             <w:tcBorders/>
             <w:vAlign w:val="center"/>
           </w:tcPr>
@@ -540,7 +540,7 @@
         <w:trPr/>
         <w:tc>
           <w:tcPr>
-            <w:tcW w:w="7021" w:type="dxa"/>
+            <w:tcW w:w="7031" w:type="dxa"/>
             <w:tcBorders/>
             <w:vAlign w:val="center"/>
           </w:tcPr>
@@ -562,7 +562,7 @@
         </w:tc>
         <w:tc>
           <w:tcPr>
-            <w:tcW w:w="2951" w:type="dxa"/>
+            <w:tcW w:w="2941" w:type="dxa"/>
             <w:tcBorders/>
             <w:vAlign w:val="center"/>
           </w:tcPr>
@@ -587,7 +587,7 @@
         <w:trPr/>
         <w:tc>
           <w:tcPr>
-            <w:tcW w:w="7021" w:type="dxa"/>
+            <w:tcW w:w="7031" w:type="dxa"/>
             <w:tcBorders/>
             <w:vAlign w:val="center"/>
           </w:tcPr>
@@ -609,7 +609,7 @@
         </w:tc>
         <w:tc>
           <w:tcPr>
-            <w:tcW w:w="2951" w:type="dxa"/>
+            <w:tcW w:w="2941" w:type="dxa"/>
             <w:tcBorders/>
             <w:vAlign w:val="center"/>
           </w:tcPr>
@@ -1082,37 +1082,37 @@
         <a:srgbClr val="000000"/>
       </a:dk1>
       <a:lt1>
-        <a:srgbClr val="ffffff"/>
+        <a:srgbClr val="FFFFFF"/>
       </a:lt1>
       <a:dk2>
         <a:srgbClr val="000000"/>
       </a:dk2>
       <a:lt2>
-        <a:srgbClr val="ffffff"/>
+        <a:srgbClr val="FFFFFF"/>
       </a:lt2>
       <a:accent1>
-        <a:srgbClr val="18a303"/>
+        <a:srgbClr val="18A303"/>
       </a:accent1>
       <a:accent2>
-        <a:srgbClr val="0369a3"/>
+        <a:srgbClr val="0369A3"/>
       </a:accent2>
       <a:accent3>
-        <a:srgbClr val="a33e03"/>
+        <a:srgbClr val="A33E03"/>
       </a:accent3>
       <a:accent4>
-        <a:srgbClr val="8e03a3"/>
+        <a:srgbClr val="8E03A3"/>
       </a:accent4>
       <a:accent5>
-        <a:srgbClr val="c99c00"/>
+        <a:srgbClr val="C99C00"/>
       </a:accent5>
       <a:accent6>
-        <a:srgbClr val="c9211e"/>
+        <a:srgbClr val="C9211E"/>
       </a:accent6>
       <a:hlink>
-        <a:srgbClr val="0000ee"/>
+        <a:srgbClr val="0000EE"/>
       </a:hlink>
       <a:folHlink>
-        <a:srgbClr val="551a8b"/>
+        <a:srgbClr val="551A8B"/>
       </a:folHlink>
     </a:clrScheme>
     <a:fontScheme name="Office">

</xml_diff>

<commit_message>
152s) Proyecto 1 Sitio Web/CMS LAESH deploy Producción en hostinger VM con dominio laesh.mx. Scripts setup reproducibles, esten al 94%,ToDos: Proyecto 1: Estabilizar index.php/cms/medico/recepcion issues/gaps encontrados con|por Laesh (fix: Samsung Galaxy Tab S10 Ultra ?. Falta pruebas estabilización integrales: Catalogo de estudios, Tabla, Gabinetes. Estabilización de/con Ws/Swoole/Seguridad (navegación multi - issues-gaps propios Web) al 73%. Avance en Block digital al:76%. Fixes 22-25-09 laesh: Se descarto v2 website: video de inicio, y banner de anuncios en cms/website. Falta en WebSite: completar publicación en SEO Google search 84%, Falta de optimizar lo del cache v?=time, swole, opcache, rte letras y tamaños. Sacar medidas para imagenes, pruebas flujos. Issues: back button. Pruebas con whatzmeapi , van bien las mas tipicas enviadas desdemi cel (laesh) hacia el telefono de mom(paciente laes --cliente).
</commit_message>
<xml_diff>
--- a/portafolio-dev-2026/blocklabgd/v1.2/contrato/Acta_Aceptacion_Adenda_Sitio_Web_v4.docx
+++ b/portafolio-dev-2026/blocklabgd/v1.2/contrato/Acta_Aceptacion_Adenda_Sitio_Web_v4.docx
@@ -7,6 +7,7 @@
         <w:pStyle w:val="Heading1"/>
         <w:bidi w:val="0"/>
         <w:spacing w:before="240" w:after="120"/>
+        <w:ind w:hanging="0" w:start="0"/>
         <w:rPr/>
       </w:pPr>
       <w:r>
@@ -22,9 +23,9 @@
           <w:ilvl w:val="0"/>
           <w:numId w:val="0"/>
         </w:numPr>
-        <w:pBdr/>
         <w:bidi w:val="0"/>
         <w:spacing w:before="200" w:after="120"/>
+        <w:ind w:hanging="0" w:start="0"/>
         <w:jc w:val="start"/>
         <w:rPr/>
       </w:pPr>
@@ -49,7 +50,25 @@
         <w:rPr>
           <w:rStyle w:val="Strong"/>
         </w:rPr>
-        <w:t>Viernes 11 de Septiembre de 2026</w:t>
+        <w:t>12</w:t>
+      </w:r>
+      <w:r>
+        <w:rPr>
+          <w:rStyle w:val="Strong"/>
+        </w:rPr>
+        <w:t xml:space="preserve"> de </w:t>
+      </w:r>
+      <w:r>
+        <w:rPr>
+          <w:rStyle w:val="Strong"/>
+        </w:rPr>
+        <w:t xml:space="preserve">Octubre </w:t>
+      </w:r>
+      <w:r>
+        <w:rPr>
+          <w:rStyle w:val="Strong"/>
+        </w:rPr>
+        <w:t>de 2026</w:t>
       </w:r>
       <w:r>
         <w:rPr/>
@@ -89,7 +108,7 @@
         <w:rPr>
           <w:rStyle w:val="Strong"/>
         </w:rPr>
-        <w:t>Sitio Web Corporativo (Anexo A)</w:t>
+        <w:t>Sitio Web (Anexo A)</w:t>
       </w:r>
       <w:r>
         <w:rPr/>
@@ -122,6 +141,7 @@
         </w:numPr>
         <w:bidi w:val="0"/>
         <w:spacing w:before="140" w:after="120"/>
+        <w:ind w:hanging="0" w:start="0"/>
         <w:jc w:val="start"/>
         <w:rPr/>
       </w:pPr>
@@ -156,7 +176,7 @@
         <w:rPr>
           <w:rStyle w:val="Strong"/>
         </w:rPr>
-        <w:t>Sitio Web Corporativo (Anexo A)</w:t>
+        <w:t>Sitio Web laesh.mx (Anexo A)</w:t>
       </w:r>
       <w:r>
         <w:rPr/>
@@ -183,6 +203,7 @@
         </w:numPr>
         <w:bidi w:val="0"/>
         <w:spacing w:before="140" w:after="120"/>
+        <w:ind w:hanging="0" w:start="0"/>
         <w:jc w:val="start"/>
         <w:rPr/>
       </w:pPr>
@@ -228,8 +249,8 @@
         </w:tblCellMar>
       </w:tblPr>
       <w:tblGrid>
-        <w:gridCol w:w="2881"/>
-        <w:gridCol w:w="7091"/>
+        <w:gridCol w:w="2879"/>
+        <w:gridCol w:w="7093"/>
       </w:tblGrid>
       <w:tr>
         <w:trPr>
@@ -237,7 +258,7 @@
         </w:trPr>
         <w:tc>
           <w:tcPr>
-            <w:tcW w:w="2881" w:type="dxa"/>
+            <w:tcW w:w="2879" w:type="dxa"/>
             <w:tcBorders/>
             <w:vAlign w:val="center"/>
           </w:tcPr>
@@ -257,7 +278,7 @@
         </w:tc>
         <w:tc>
           <w:tcPr>
-            <w:tcW w:w="7091" w:type="dxa"/>
+            <w:tcW w:w="7093" w:type="dxa"/>
             <w:tcBorders/>
             <w:vAlign w:val="center"/>
           </w:tcPr>
@@ -280,7 +301,7 @@
         <w:trPr/>
         <w:tc>
           <w:tcPr>
-            <w:tcW w:w="2881" w:type="dxa"/>
+            <w:tcW w:w="2879" w:type="dxa"/>
             <w:tcBorders/>
             <w:vAlign w:val="center"/>
           </w:tcPr>
@@ -302,7 +323,7 @@
         </w:tc>
         <w:tc>
           <w:tcPr>
-            <w:tcW w:w="7091" w:type="dxa"/>
+            <w:tcW w:w="7093" w:type="dxa"/>
             <w:tcBorders/>
             <w:vAlign w:val="center"/>
           </w:tcPr>
@@ -325,7 +346,7 @@
         <w:trPr/>
         <w:tc>
           <w:tcPr>
-            <w:tcW w:w="2881" w:type="dxa"/>
+            <w:tcW w:w="2879" w:type="dxa"/>
             <w:tcBorders/>
             <w:vAlign w:val="center"/>
           </w:tcPr>
@@ -347,7 +368,7 @@
         </w:tc>
         <w:tc>
           <w:tcPr>
-            <w:tcW w:w="7091" w:type="dxa"/>
+            <w:tcW w:w="7093" w:type="dxa"/>
             <w:tcBorders/>
             <w:vAlign w:val="center"/>
           </w:tcPr>
@@ -361,7 +382,7 @@
             </w:pPr>
             <w:r>
               <w:rPr/>
-              <w:t>Centralización del catálogo de estudios clínicos administrables en un solo lugar para alimentar de forma unificada tanto al Sitio Web como al Bloc Digital.</w:t>
+              <w:t>Centralización del catálogo de estudios clínicos administrables en un solo lugar para alimentar de forma unificada tanto al Sitio Web como al Bloc Digital, busquedas de estudios clínicos  desde el Sitio Web.</w:t>
             </w:r>
           </w:p>
         </w:tc>
@@ -370,7 +391,7 @@
         <w:trPr/>
         <w:tc>
           <w:tcPr>
-            <w:tcW w:w="2881" w:type="dxa"/>
+            <w:tcW w:w="2879" w:type="dxa"/>
             <w:tcBorders/>
             <w:vAlign w:val="center"/>
           </w:tcPr>
@@ -392,7 +413,7 @@
         </w:tc>
         <w:tc>
           <w:tcPr>
-            <w:tcW w:w="7091" w:type="dxa"/>
+            <w:tcW w:w="7093" w:type="dxa"/>
             <w:tcBorders/>
             <w:vAlign w:val="center"/>
           </w:tcPr>
@@ -415,7 +436,7 @@
         <w:trPr/>
         <w:tc>
           <w:tcPr>
-            <w:tcW w:w="2881" w:type="dxa"/>
+            <w:tcW w:w="2879" w:type="dxa"/>
             <w:tcBorders/>
             <w:vAlign w:val="center"/>
           </w:tcPr>
@@ -437,7 +458,7 @@
         </w:tc>
         <w:tc>
           <w:tcPr>
-            <w:tcW w:w="7091" w:type="dxa"/>
+            <w:tcW w:w="7093" w:type="dxa"/>
             <w:tcBorders/>
             <w:vAlign w:val="center"/>
           </w:tcPr>
@@ -466,6 +487,7 @@
         </w:numPr>
         <w:bidi w:val="0"/>
         <w:spacing w:before="140" w:after="120"/>
+        <w:ind w:hanging="0" w:start="0"/>
         <w:jc w:val="start"/>
         <w:rPr/>
       </w:pPr>
@@ -640,6 +662,7 @@
         </w:numPr>
         <w:bidi w:val="0"/>
         <w:spacing w:before="140" w:after="120"/>
+        <w:ind w:hanging="0" w:start="0"/>
         <w:jc w:val="start"/>
         <w:rPr/>
       </w:pPr>
@@ -674,7 +697,25 @@
         <w:rPr>
           <w:rStyle w:val="Strong"/>
         </w:rPr>
-        <w:t>Sábado 12 de Septiembre de 2026</w:t>
+        <w:t>12</w:t>
+      </w:r>
+      <w:r>
+        <w:rPr>
+          <w:rStyle w:val="Strong"/>
+        </w:rPr>
+        <w:t xml:space="preserve"> de </w:t>
+      </w:r>
+      <w:r>
+        <w:rPr>
+          <w:rStyle w:val="Strong"/>
+        </w:rPr>
+        <w:t xml:space="preserve">Octubre </w:t>
+      </w:r>
+      <w:r>
+        <w:rPr>
+          <w:rStyle w:val="Strong"/>
+        </w:rPr>
+        <w:t>de 2026</w:t>
       </w:r>
       <w:r>
         <w:rPr/>
@@ -684,11 +725,31 @@
         <w:rPr>
           <w:rStyle w:val="Strong"/>
         </w:rPr>
-        <w:t>Lunes 21 de Septiembre de 2026</w:t>
-      </w:r>
-      <w:r>
-        <w:rPr/>
-        <w:t xml:space="preserve"> para la atención sin costo de cualquier defecto de software en el código entregado.</w:t>
+        <w:t xml:space="preserve">21 de </w:t>
+      </w:r>
+      <w:r>
+        <w:rPr>
+          <w:rStyle w:val="Strong"/>
+        </w:rPr>
+        <w:t>Octubre</w:t>
+      </w:r>
+      <w:r>
+        <w:rPr>
+          <w:rStyle w:val="Strong"/>
+        </w:rPr>
+        <w:t xml:space="preserve"> de 2026</w:t>
+      </w:r>
+      <w:r>
+        <w:rPr/>
+        <w:t xml:space="preserve"> para la atención sin costo de cualquier defecto de software en el código </w:t>
+      </w:r>
+      <w:r>
+        <w:rPr/>
+        <w:t>y despliegue</w:t>
+      </w:r>
+      <w:r>
+        <w:rPr/>
+        <w:t xml:space="preserve"> entregado.</w:t>
       </w:r>
     </w:p>
     <w:p>
@@ -795,7 +856,7 @@
       <w:pgNumType w:fmt="decimal"/>
       <w:formProt w:val="false"/>
       <w:textDirection w:val="lrTb"/>
-      <w:docGrid w:type="default" w:linePitch="600" w:charSpace="38911"/>
+      <w:docGrid w:type="default" w:linePitch="600" w:charSpace="38502"/>
     </w:sectPr>
   </w:body>
 </w:document>
@@ -823,15 +884,16 @@
     <w:qFormat/>
     <w:pPr>
       <w:widowControl w:val="false"/>
-      <w:kinsoku w:val="true"/>
+      <w:suppressAutoHyphens w:val="true"/>
       <w:overflowPunct w:val="true"/>
-      <w:autoSpaceDE w:val="true"/>
       <w:bidi w:val="0"/>
-      <w:spacing w:lineRule="auto" w:line="360"/>
+      <w:spacing w:lineRule="auto" w:line="360" w:before="0" w:after="0"/>
+      <w:jc w:val="start"/>
     </w:pPr>
     <w:rPr>
       <w:rFonts w:ascii="Inter;Arial;sans-serif" w:hAnsi="Inter;Arial;sans-serif" w:eastAsia="Inter;Arial;sans-serif" w:cs="Inter;Arial;sans-serif"/>
       <w:color w:val="1A202C"/>
+      <w:kern w:val="0"/>
       <w:sz w:val="21"/>
       <w:szCs w:val="21"/>
       <w:lang w:val="en-US" w:eastAsia="zh-CN" w:bidi="hi-IN"/>
@@ -843,10 +905,6 @@
     <w:next w:val="BodyText"/>
     <w:qFormat/>
     <w:pPr>
-      <w:numPr>
-        <w:ilvl w:val="0"/>
-        <w:numId w:val="0"/>
-      </w:numPr>
       <w:pBdr>
         <w:bottom w:val="single" w:sz="12" w:space="4" w:color="0D9488"/>
       </w:pBdr>
@@ -870,10 +928,6 @@
     <w:qFormat/>
     <w:pPr>
       <w:keepNext w:val="true"/>
-      <w:numPr>
-        <w:ilvl w:val="0"/>
-        <w:numId w:val="0"/>
-      </w:numPr>
       <w:pBdr>
         <w:bottom w:val="single" w:sz="2" w:space="2" w:color="CCFBF1"/>
       </w:pBdr>
@@ -896,10 +950,6 @@
     <w:qFormat/>
     <w:pPr>
       <w:keepNext w:val="true"/>
-      <w:numPr>
-        <w:ilvl w:val="0"/>
-        <w:numId w:val="0"/>
-      </w:numPr>
       <w:spacing w:before="140" w:after="120"/>
       <w:outlineLvl w:val="2"/>
     </w:pPr>
@@ -955,6 +1005,21 @@
       <w:color w:val="0D9488"/>
       <w:u w:val="none"/>
       <w:effect w:val="none"/>
+    </w:rPr>
+  </w:style>
+  <w:style w:type="paragraph" w:styleId="Heading">
+    <w:name w:val="Heading"/>
+    <w:basedOn w:val="Normal"/>
+    <w:next w:val="BodyText"/>
+    <w:qFormat/>
+    <w:pPr>
+      <w:keepNext w:val="true"/>
+      <w:spacing w:before="240" w:after="283"/>
+    </w:pPr>
+    <w:rPr>
+      <w:rFonts w:ascii="Liberation Sans" w:hAnsi="Liberation Sans" w:eastAsia="Noto Sans CJK SC" w:cs="Lohit Devanagari"/>
+      <w:sz w:val="28"/>
+      <w:szCs w:val="28"/>
     </w:rPr>
   </w:style>
   <w:style w:type="paragraph" w:styleId="BodyText">
@@ -965,21 +1030,6 @@
       <w:jc w:val="both"/>
     </w:pPr>
     <w:rPr/>
-  </w:style>
-  <w:style w:type="paragraph" w:styleId="Heading">
-    <w:name w:val="Heading"/>
-    <w:basedOn w:val="Normal"/>
-    <w:next w:val="BodyText"/>
-    <w:qFormat/>
-    <w:pPr>
-      <w:keepNext w:val="true"/>
-      <w:spacing w:before="240" w:after="283"/>
-    </w:pPr>
-    <w:rPr>
-      <w:rFonts w:ascii="Liberation Sans" w:hAnsi="Liberation Sans" w:eastAsia="Noto Sans CJK SC" w:cs="Lohit Devanagari"/>
-      <w:sz w:val="28"/>
-      <w:szCs w:val="28"/>
-    </w:rPr>
   </w:style>
   <w:style w:type="paragraph" w:styleId="List">
     <w:name w:val="List"/>

</xml_diff>